<commit_message>
Remove Multi-NIC policy-routing reconciler project
</commit_message>
<xml_diff>
--- a/assets/resume-master.docx
+++ b/assets/resume-master.docx
@@ -88,7 +88,7 @@
         <w:t>Networking:</w:t>
       </w:r>
       <w:r>
-        <w:t xml:space="preserve"> Computer networking, multi-NIC policy routing, network administration, Cisco IOS</w:t>
+        <w:t xml:space="preserve"> Computer networking, network administration, Cisco IOS</w:t>
       </w:r>
     </w:p>
     <w:p>
@@ -147,7 +147,7 @@
         <w:pStyle w:val="ListBullet"/>
       </w:pPr>
       <w:r>
-        <w:t>Design and build diagnostic tooling and automation that scale, including a VM disk architecture conversion utility (SCSI to NVMe) and a multi-NIC policy-routing reconciler for Azure Linux.</w:t>
+        <w:t>Design and build diagnostic tooling and automation that scale, including a VM disk architecture conversion utility (SCSI to NVMe).</w:t>
       </w:r>
     </w:p>
     <w:p>

</xml_diff>